<commit_message>
Impact wrenches script: cut Bob Vila mentions 11 -> 4, balance outlet attributions
Co-Authored-By: Claude Opus 5.5 <noreply@anthropic.com>
</commit_message>
<xml_diff>
--- a/scripts/6-best-cordless-impact-wrenches-for-automotive-work-2026.docx
+++ b/scripts/6-best-cordless-impact-wrenches-for-automotive-work-2026.docx
@@ -25,7 +25,7 @@
           <w:sz w:val="20"/>
           <w:szCs w:val="20"/>
         </w:rPr>
-        <w:t xml:space="preserve">Script total: 2020 words. Hook type 6 (Category Lie). Villain: CRAFTSMAN CMCF921B (type D).</w:t>
+        <w:t xml:space="preserve">Script total: 1994 words. Hook type 6 (Category Lie). Villain: CRAFTSMAN CMCF921B (type D).</w:t>
       </w:r>
     </w:p>
     <w:p>
@@ -276,7 +276,7 @@
             </w:tcMar>
           </w:tcPr>
           <w:p>
-            <w:hyperlink w:history="1" r:id="rId7flbpafohio5qmoysadbk">
+            <w:hyperlink w:history="1" r:id="rIdnzfax5apyioxf_xtbxn_z">
               <w:r>
                 <w:rPr>
                   <w:rStyle w:val="Hyperlink"/>
@@ -385,7 +385,7 @@
             </w:tcMar>
           </w:tcPr>
           <w:p>
-            <w:hyperlink w:history="1" r:id="rIdlcun8bn7ai0rnvpxfnuff">
+            <w:hyperlink w:history="1" r:id="rIdprjnwdwwgtu_zmaahrlzp">
               <w:r>
                 <w:rPr>
                   <w:rStyle w:val="Hyperlink"/>
@@ -494,7 +494,7 @@
             </w:tcMar>
           </w:tcPr>
           <w:p>
-            <w:hyperlink w:history="1" r:id="rIdce2c8um6qvnajfndcyfbt">
+            <w:hyperlink w:history="1" r:id="rIdcva5ylw8u9c96dzx0crdd">
               <w:r>
                 <w:rPr>
                   <w:rStyle w:val="Hyperlink"/>
@@ -603,7 +603,7 @@
             </w:tcMar>
           </w:tcPr>
           <w:p>
-            <w:hyperlink w:history="1" r:id="rIdatyu9jarekb3flobhi-dl">
+            <w:hyperlink w:history="1" r:id="rIdgtafvwziblhc3s-usppnr">
               <w:r>
                 <w:rPr>
                   <w:rStyle w:val="Hyperlink"/>
@@ -712,7 +712,7 @@
             </w:tcMar>
           </w:tcPr>
           <w:p>
-            <w:hyperlink w:history="1" r:id="rIdr39kvw2jn2hz5ic2l_nwi">
+            <w:hyperlink w:history="1" r:id="rIdcyklf9auq3skgbo0dfhds">
               <w:r>
                 <w:rPr>
                   <w:rStyle w:val="Hyperlink"/>
@@ -821,7 +821,7 @@
             </w:tcMar>
           </w:tcPr>
           <w:p>
-            <w:hyperlink w:history="1" r:id="rId4oq9ivxypn-g0lnwub0gp">
+            <w:hyperlink w:history="1" r:id="rIdxygqluzmtriw01nv5ulxr">
               <w:r>
                 <w:rPr>
                   <w:rStyle w:val="Hyperlink"/>
@@ -930,7 +930,7 @@
             </w:tcMar>
           </w:tcPr>
           <w:p>
-            <w:hyperlink w:history="1" r:id="rId6dcywypvlzjodmhnmshdh">
+            <w:hyperlink w:history="1" r:id="rIdwcjopmjbcamqfycgidb8z">
               <w:r>
                 <w:rPr>
                   <w:rStyle w:val="Hyperlink"/>
@@ -1094,7 +1094,7 @@
             </w:tcMar>
           </w:tcPr>
           <w:p>
-            <w:hyperlink w:history="1" r:id="rId0ni1latq-mei1uvaxaymo">
+            <w:hyperlink w:history="1" r:id="rIdcaseaje5obwp6plh4qvjn">
               <w:r>
                 <w:rPr>
                   <w:rStyle w:val="Hyperlink"/>
@@ -1151,7 +1151,7 @@
             </w:tcMar>
           </w:tcPr>
           <w:p>
-            <w:hyperlink w:history="1" r:id="rId0hlg-r0w7b8knukxudjgf">
+            <w:hyperlink w:history="1" r:id="rIdiphb22kca14d3vmckanuv">
               <w:r>
                 <w:rPr>
                   <w:rStyle w:val="Hyperlink"/>
@@ -1208,7 +1208,7 @@
             </w:tcMar>
           </w:tcPr>
           <w:p>
-            <w:hyperlink w:history="1" r:id="rIdfh4frojd3wlchshsqdpjn">
+            <w:hyperlink w:history="1" r:id="rIdn3rzrmxreqbywdnytt_vb">
               <w:r>
                 <w:rPr>
                   <w:rStyle w:val="Hyperlink"/>
@@ -1265,7 +1265,7 @@
             </w:tcMar>
           </w:tcPr>
           <w:p>
-            <w:hyperlink w:history="1" r:id="rIdw5d2babfmuozjmsikytub">
+            <w:hyperlink w:history="1" r:id="rIdd3pzzyg4zem8nb43uegxf">
               <w:r>
                 <w:rPr>
                   <w:rStyle w:val="Hyperlink"/>
@@ -1322,7 +1322,7 @@
             </w:tcMar>
           </w:tcPr>
           <w:p>
-            <w:hyperlink w:history="1" r:id="rIdyr1p5zkxe9zhenm8c2urp">
+            <w:hyperlink w:history="1" r:id="rId3thrqptjacnsulyvth55q">
               <w:r>
                 <w:rPr>
                   <w:rStyle w:val="Hyperlink"/>
@@ -1379,7 +1379,7 @@
             </w:tcMar>
           </w:tcPr>
           <w:p>
-            <w:hyperlink w:history="1" r:id="rId006dzgpdonqpugsyasty5">
+            <w:hyperlink w:history="1" r:id="rIdbvtrve16upo6nfvtqeg3w">
               <w:r>
                 <w:rPr>
                   <w:rStyle w:val="Hyperlink"/>
@@ -1436,7 +1436,7 @@
             </w:tcMar>
           </w:tcPr>
           <w:p>
-            <w:hyperlink w:history="1" r:id="rIdkevwa3wf6il3_ibhytufi">
+            <w:hyperlink w:history="1" r:id="rIdaeanjnkcbzz3mcizltarq">
               <w:r>
                 <w:rPr>
                   <w:rStyle w:val="Hyperlink"/>
@@ -1493,7 +1493,7 @@
             </w:tcMar>
           </w:tcPr>
           <w:p>
-            <w:hyperlink w:history="1" r:id="rIdsqmihzxnnkynabmp31wb2">
+            <w:hyperlink w:history="1" r:id="rIdbf80xskicody3bay1ne0w">
               <w:r>
                 <w:rPr>
                   <w:rStyle w:val="Hyperlink"/>
@@ -1550,7 +1550,7 @@
             </w:tcMar>
           </w:tcPr>
           <w:p>
-            <w:hyperlink w:history="1" r:id="rIdyai6cc4r5xpabdvq-ztfi">
+            <w:hyperlink w:history="1" r:id="rIdvhz-xk8vwyadmvgivtpfd">
               <w:r>
                 <w:rPr>
                   <w:rStyle w:val="Hyperlink"/>
@@ -1607,7 +1607,7 @@
             </w:tcMar>
           </w:tcPr>
           <w:p>
-            <w:hyperlink w:history="1" r:id="rIdmh-8wlgeqy8_1fqumzrdy">
+            <w:hyperlink w:history="1" r:id="rIddbtwhrppikaxixya_pv0j">
               <w:r>
                 <w:rPr>
                   <w:rStyle w:val="Hyperlink"/>
@@ -1664,7 +1664,7 @@
             </w:tcMar>
           </w:tcPr>
           <w:p>
-            <w:hyperlink w:history="1" r:id="rIdlooiy4ud3pxanrfsnfgy9">
+            <w:hyperlink w:history="1" r:id="rIdwz5qccxd4roww7wvvbaei">
               <w:r>
                 <w:rPr>
                   <w:rStyle w:val="Hyperlink"/>
@@ -3124,7 +3124,7 @@
           <w:sz w:val="20"/>
           <w:szCs w:val="20"/>
         </w:rPr>
-        <w:t xml:space="preserve">• Compliance grep: clean. Hook 150, picks 236-239 (incl. opener), villain 149, free 130, tail 162; 0 sentences of 30+ words, avg 11.5. Order: HOOK P6 P5 P4 VILLAIN P3 P2 P1 FREE TAIL. No content-farm sites used.</w:t>
+        <w:t xml:space="preserve">• Compliance grep: clean. Hook 150, picks 232-239 (incl. opener), villain 148, free 127, tail 162; 0 sentences of 30+ words, avg 11.3. Outlet balance: Bob Vila 4, Pro Tool Reviews 5, Car and Driver 5, Popular Mechanics 5, The Drive 2 mentions (cut Bob Vila from 11 after user feedback). Order: HOOK P6 P5 P4 VILLAIN P3 P2 P1 FREE TAIL. No content-farm sites used.</w:t>
       </w:r>
     </w:p>
     <w:p>
@@ -3175,7 +3175,7 @@
           <w:b/>
           <w:bCs/>
         </w:rPr>
-        <w:t xml:space="preserve">NUMBER 6 — CRAFTSMAN CMCF940M1 — 238 words</w:t>
+        <w:t xml:space="preserve">NUMBER 6 — CRAFTSMAN CMCF940M1 — 233 words</w:t>
       </w:r>
     </w:p>
     <w:p>
@@ -3211,7 +3211,7 @@
           <w:sz w:val="22"/>
           <w:szCs w:val="22"/>
         </w:rPr>
-        <w:t xml:space="preserve">The listing gives seven hundred foot-pounds of fastening torque and one thousand of nut-busting torque. The brushless motor spins up to two thousand RPM. Three speed settings sit on top of a variable-speed trigger, so you can start a lug gently and then open it up. The half-inch anvil uses a hog ring, so sockets pop on and off by hand. An LED lights up the wheel well. Bob Vila noted that the glass-filled nylon housing resists automotive fluids and solvents, which matters next to brake cleaner and oil. They put the weight at five point nine pounds without the battery. The kit includes one four-amp-hour V20 battery, a charger, and a soft bag. CRAFTSMAN gives a three-year limited warranty.</w:t>
+        <w:t xml:space="preserve">The listing gives seven hundred foot-pounds of fastening torque and one thousand of nut-busting torque. The brushless motor spins up to two thousand RPM. Three speed settings sit on top of a variable-speed trigger, so you can start a lug gently and then open it up. The half-inch anvil uses a hog ring, so sockets pop on and off by hand. An LED lights up the wheel well. The glass-filled nylon housing resists automotive fluids and solvents, which matters next to brake cleaner and oil. It weighs five point nine pounds without the battery. The kit includes one four-amp-hour V20 battery, a charger, and a soft bag. CRAFTSMAN gives a three-year limited warranty.</w:t>
       </w:r>
     </w:p>
     <w:p>
@@ -3235,7 +3235,7 @@
           <w:sz w:val="22"/>
           <w:szCs w:val="22"/>
         </w:rPr>
-        <w:t xml:space="preserve">Now, the honest limits. Bob Vila called it heavy, and the kit comes with only one battery. The listing shows no auto-stop mode. Remember the hook? Seven hundred is almost nine times a Civic's eighty, so snug lugs on the lowest speed.</w:t>
+        <w:t xml:space="preserve">Now, the honest limits. Their testers called it heavy, and the kit comes with only one battery. The listing shows no auto-stop or bolt-removal mode. Remember the hook? Seven hundred is almost nine times a Civic's eighty, so snug lugs on the lowest speed.</w:t>
       </w:r>
     </w:p>
     <w:p>
@@ -3272,7 +3272,7 @@
           <w:b/>
           <w:bCs/>
         </w:rPr>
-        <w:t xml:space="preserve">NUMBER 5 — DEWALT ATOMIC DCF921P2 — 239 words</w:t>
+        <w:t xml:space="preserve">NUMBER 5 — DEWALT ATOMIC DCF921P2 — 234 words</w:t>
       </w:r>
     </w:p>
     <w:p>
@@ -3308,7 +3308,7 @@
           <w:sz w:val="22"/>
           <w:szCs w:val="22"/>
         </w:rPr>
-        <w:t xml:space="preserve">Popular Mechanics measured it under five inches, tip to tail. Without the battery, it weighs about two and a half pounds, and Bob Vila put it under four pounds with one. The listing gives three hundred foot-pounds of fastening torque and four hundred fifty of breakaway. The brushless motor spins up to two thousand five hundred RPM. Bob Vila counts two speeds plus two special modes, while the listing calls them four settings. The key one is Precision Wrench. It stops before a nut is overtightened, and it keeps a loosened nut from spinning off. Three LEDs ring the nose, with two brightness levels. The kit includes two five-amp-hour batteries, a charger, a bag, and a belt clip. DEWALT's standard tool warranty is three years limited.</w:t>
+        <w:t xml:space="preserve">Popular Mechanics measured it under five inches, tip to tail. Without the battery, it weighs about two and a half pounds, and under four pounds with one. The listing gives three hundred foot-pounds of fastening torque and four hundred fifty of breakaway. The brushless motor spins up to two thousand five hundred RPM. Testers count two speeds plus two special modes, while the listing calls them four settings. The key one is Precision Wrench. It stops before a nut is overtightened, and it keeps a loosened nut from spinning off. Three LEDs ring the nose, with two brightness levels. The kit includes two five-amp-hour batteries, a charger, a bag, and a belt clip. DEWALT's standard tool warranty is three years limited.</w:t>
       </w:r>
     </w:p>
     <w:p>
@@ -3332,7 +3332,7 @@
           <w:sz w:val="22"/>
           <w:szCs w:val="22"/>
         </w:rPr>
-        <w:t xml:space="preserve">Now, the honest limits. Bob Vila said it took a few ticks longer on a truck lug nut. Popular Mechanics called it the loudest tool they tested.</w:t>
+        <w:t xml:space="preserve">Now, the honest limits. On a truck lug nut, it took a few ticks longer than bigger wrenches. Popular Mechanics called it the loudest tool they tested.</w:t>
       </w:r>
     </w:p>
     <w:p>
@@ -3466,7 +3466,7 @@
           <w:b/>
           <w:bCs/>
         </w:rPr>
-        <w:t xml:space="preserve">THE VILLAIN — CRAFTSMAN CMCF921B — 149 words</w:t>
+        <w:t xml:space="preserve">THE VILLAIN — CRAFTSMAN CMCF921B — 148 words</w:t>
       </w:r>
     </w:p>
     <w:p>
@@ -3490,7 +3490,7 @@
           <w:sz w:val="22"/>
           <w:szCs w:val="22"/>
         </w:rPr>
-        <w:t xml:space="preserve">On paper, it looks like a smart buy. It was the lightest wrench in the ten-tool Pro Tool Reviews test. It has a brushless motor, a hog-ring anvil, two speeds, and an LED. Pro Tool Reviews even said it can handle nearly anything on a well-maintained passenger car.</w:t>
+        <w:t xml:space="preserve">On paper, it looks like a smart buy. It was the lightest wrench in the ten-tool Pro Tool Reviews test. It has a brushless motor, a hog-ring anvil, two speeds, and an LED. The testers even said it can handle nearly anything on a well-maintained passenger car.</w:t>
       </w:r>
     </w:p>
     <w:p>
@@ -3539,7 +3539,7 @@
           <w:b/>
           <w:bCs/>
         </w:rPr>
-        <w:t xml:space="preserve">NUMBER 3 — MILWAUKEE 2962-20 — 238 words</w:t>
+        <w:t xml:space="preserve">NUMBER 3 — MILWAUKEE 2962-20 — 234 words</w:t>
       </w:r>
     </w:p>
     <w:p>
@@ -3575,7 +3575,7 @@
           <w:sz w:val="22"/>
           <w:szCs w:val="22"/>
         </w:rPr>
-        <w:t xml:space="preserve">Pro Tool Reviews measured the head at about five point nine inches, the most compact of their ten. Without the battery, it weighs about three and a half pounds. Milwaukee lists five hundred fifty foot-pounds of fastening torque and six hundred fifty of breakaway. Three speeds run up to two thousand five hundred seventy-five RPM. Mode four is the clever one. Going forward, it shuts off at about thirty-five foot-pounds, so lugs get snug, not stretched. In reverse, it slows down once a bolt breaks free. A three-LED ring kills shadows in the wheel well. Milwaukee and Pro Tool Reviews list a five-year tool warranty, but the listing says two years.</w:t>
+        <w:t xml:space="preserve">The head measures about five point nine inches, the most compact of ten mid-torque wrenches tested. Without the battery, it weighs about three and a half pounds. Milwaukee lists five hundred fifty foot-pounds of fastening torque and six hundred fifty of breakaway. Three speeds run up to two thousand five hundred seventy-five RPM. Mode four is the clever one. Going forward, it shuts off at about thirty-five foot-pounds, so lugs get snug, not stretched. In reverse, it slows down once a bolt breaks free. A three-LED ring kills shadows in the wheel well. Milwaukee's own site lists a five-year tool warranty, but the store listing says two years.</w:t>
       </w:r>
     </w:p>
     <w:p>
@@ -3599,7 +3599,7 @@
           <w:sz w:val="22"/>
           <w:szCs w:val="22"/>
         </w:rPr>
-        <w:t xml:space="preserve">Now, the honest limits. This link is the tool only, so the battery and charger are sold separately. Pro Tool Reviews found the friction ring tight on some sockets. And remember the hook: thirty-five foot-pounds is only a snug.</w:t>
+        <w:t xml:space="preserve">Now, the honest limits. This link is the tool only, so the battery and charger are sold separately. Their testers found the friction ring tight on some sockets. And remember the hook: thirty-five foot-pounds is only a snug.</w:t>
       </w:r>
     </w:p>
     <w:p>
@@ -3636,7 +3636,7 @@
           <w:b/>
           <w:bCs/>
         </w:rPr>
-        <w:t xml:space="preserve">NUMBER 2 — MILWAUKEE 2967-21B — 239 words</w:t>
+        <w:t xml:space="preserve">NUMBER 2 — MILWAUKEE 2967-21B — 235 words</w:t>
       </w:r>
     </w:p>
     <w:p>
@@ -3672,7 +3672,7 @@
           <w:sz w:val="22"/>
           <w:szCs w:val="22"/>
         </w:rPr>
-        <w:t xml:space="preserve">Milwaukee lists one thousand one hundred foot-pounds of fastening torque and one thousand five hundred of nut-busting torque. With a Forge battery, those climb to one thousand two hundred and one thousand six hundred. Four modes run up to two thousand RPM and two thousand four hundred impacts per minute. Mode four shuts off at about fifty foot-pounds going forward, and slows down in reverse once a bolt breaks free. The friction ring makes socket swaps fast, and a three-LED ring lights the work. Pro Tool Reviews measured seven point six inches long and seven and a half pounds with a five-amp-hour battery. The kit includes that battery, a charger, and a bag. Milwaukee gives five years on the tool and three on the battery.</w:t>
+        <w:t xml:space="preserve">Milwaukee lists one thousand one hundred foot-pounds of fastening torque and one thousand five hundred of nut-busting torque. With a Forge battery, those climb to one thousand two hundred and one thousand six hundred. Four modes run up to two thousand RPM and two thousand four hundred impacts per minute. Mode four shuts off at about fifty foot-pounds going forward, and slows down in reverse once a bolt breaks free. The friction ring makes socket swaps fast, and a three-LED ring lights the work. It measures seven point six inches long and weighs seven and a half pounds with a five-amp-hour battery. The kit includes that battery, a charger, and a bag. Milwaukee gives five years on the tool and three on the battery.</w:t>
       </w:r>
     </w:p>
     <w:p>
@@ -3696,7 +3696,7 @@
           <w:sz w:val="22"/>
           <w:szCs w:val="22"/>
         </w:rPr>
-        <w:t xml:space="preserve">Now, the honest limits. Bob Vila called it heavy and said it has more power than many DIYers need. The Drive called it too large for regular use. Remember the hook? One thousand five hundred is for seized truck bolts, not a Civic.</w:t>
+        <w:t xml:space="preserve">Now, the honest limits. It is heavy, and it has more power than many DIYers need. The Drive called it too large for regular use. Remember the hook? One thousand five hundred is for seized truck bolts, not a Civic.</w:t>
       </w:r>
     </w:p>
     <w:p>
@@ -3733,7 +3733,7 @@
           <w:b/>
           <w:bCs/>
         </w:rPr>
-        <w:t xml:space="preserve">NUMBER 1 — DEWALT DCF891B — 236 words</w:t>
+        <w:t xml:space="preserve">NUMBER 1 — DEWALT DCF891B — 232 words</w:t>
       </w:r>
     </w:p>
     <w:p>
@@ -3769,7 +3769,7 @@
           <w:sz w:val="22"/>
           <w:szCs w:val="22"/>
         </w:rPr>
-        <w:t xml:space="preserve">DEWALT lists six hundred foot-pounds of fastening torque and eight hundred of breakaway. Three speeds top out at two thousand RPM and three thousand two hundred fifty impacts per minute. The fourth setting is Precision Wrench. Going forward, it stops about half a second after impacting starts, so lugs are not overtightened. In reverse, it stops impacting and slows down once the nut breaks, so nothing flies off. Pro Tool Reviews weighed it at three point eight pounds bare and five point three with a five-amp-hour battery. The LED has low, high, and off. DEWALT gives three years of warranty, one year of free service, and a ninety-day money-back guarantee.</w:t>
+        <w:t xml:space="preserve">DEWALT lists six hundred foot-pounds of fastening torque and eight hundred of breakaway. Three speeds top out at two thousand RPM and three thousand two hundred fifty impacts per minute. The fourth setting is Precision Wrench. Going forward, it stops about half a second after impacting starts, so lugs are not overtightened. In reverse, it stops impacting and slows down once the nut breaks, so nothing flies off. It weighs three point eight pounds bare and five point three with a five-amp-hour battery. The LED has low, high, and off. DEWALT gives three years of warranty, one year of free service, and a ninety-day money-back guarantee.</w:t>
       </w:r>
     </w:p>
     <w:p>
@@ -3830,7 +3830,7 @@
           <w:b/>
           <w:bCs/>
         </w:rPr>
-        <w:t xml:space="preserve">THE FREE UPGRADE — 130 words</w:t>
+        <w:t xml:space="preserve">THE FREE UPGRADE — 127 words</w:t>
       </w:r>
     </w:p>
     <w:p>
@@ -3866,7 +3866,7 @@
           <w:sz w:val="22"/>
           <w:szCs w:val="22"/>
         </w:rPr>
-        <w:t xml:space="preserve">First, use impact sockets, the black ones built for impact tools. Bob Vila warns that chrome sockets are not made for impact work.</w:t>
+        <w:t xml:space="preserve">First, use impact sockets, the black ones built for impact tools. Regular chrome sockets are not made for impact work.</w:t>
       </w:r>
     </w:p>
     <w:p>

</xml_diff>